<commit_message>
changes Account Code to code and filters by code
</commit_message>
<xml_diff>
--- a/2018 Giving ReceiptsPg2.docx
+++ b/2018 Giving ReceiptsPg2.docx
@@ -65,10 +65,16 @@
     <w:p>
       <w:r>
         <w:tab/>
-        <w:t>{Account Code}</w:t>
+        <w:t>{</w:t>
+      </w:r>
+      <w:r>
+        <w:t>c</w:t>
       </w:r>
       <w:bookmarkStart w:id="0" w:name="_GoBack"/>
       <w:bookmarkEnd w:id="0"/>
+      <w:r>
+        <w:t>ode}</w:t>
+      </w:r>
     </w:p>
     <w:p>
       <w:r>
@@ -1544,7 +1550,7 @@
 </file>
 
 <file path=customXml/itemProps1.xml><?xml version="1.0" encoding="utf-8"?>
-<ds:datastoreItem xmlns:ds="http://schemas.openxmlformats.org/officeDocument/2006/customXml" ds:itemID="{6E06677F-E586-487B-B096-C803065BC882}">
+<ds:datastoreItem xmlns:ds="http://schemas.openxmlformats.org/officeDocument/2006/customXml" ds:itemID="{10AF308D-E5A6-4CB3-8DD6-1C0F37F7F101}">
   <ds:schemaRefs>
     <ds:schemaRef ds:uri="http://schemas.openxmlformats.org/officeDocument/2006/bibliography"/>
   </ds:schemaRefs>

</xml_diff>

<commit_message>
spits out all transactions
</commit_message>
<xml_diff>
--- a/2018 Giving ReceiptsPg2.docx
+++ b/2018 Giving ReceiptsPg2.docx
@@ -101,21 +101,6 @@
         </w:rPr>
         <w:t>Calendar Year 2018</w:t>
       </w:r>
-    </w:p>
-    <w:p>
-      <w:pPr>
-        <w:pStyle w:val="NormalWeb"/>
-      </w:pPr>
-      <w:r>
-        <w:rPr>
-          <w:rFonts w:ascii="font000000002015883f" w:hAnsi="font000000002015883f"/>
-          <w:sz w:val="16"/>
-          <w:szCs w:val="16"/>
-        </w:rPr>
-        <w:t xml:space="preserve">Fund is Collegiate, Offering, Peru Initiative, Short-Term Missions, Six-Year. </w:t>
-      </w:r>
-      <w:bookmarkStart w:id="0" w:name="_GoBack"/>
-      <w:bookmarkEnd w:id="0"/>
     </w:p>
     <w:tbl>
       <w:tblPr>
@@ -155,7 +140,7 @@
               <w:cnfStyle w:val="100000000000" w:firstRow="1" w:lastRow="0" w:firstColumn="0" w:lastColumn="0" w:oddVBand="0" w:evenVBand="0" w:oddHBand="0" w:evenHBand="0" w:firstRowFirstColumn="0" w:firstRowLastColumn="0" w:lastRowFirstColumn="0" w:lastRowLastColumn="0"/>
             </w:pPr>
             <w:r>
-              <w:t>Fund</w:t>
+              <w:t>Account</w:t>
             </w:r>
           </w:p>
         </w:tc>
@@ -211,8 +196,10 @@
               <w:t>{</w:t>
             </w:r>
             <w:r>
-              <w:t>Department</w:t>
+              <w:t>account</w:t>
             </w:r>
+            <w:bookmarkStart w:id="0" w:name="_GoBack"/>
+            <w:bookmarkEnd w:id="0"/>
             <w:r>
               <w:t>}</w:t>
             </w:r>
@@ -276,14 +263,26 @@
           <w:p>
             <w:pPr>
               <w:cnfStyle w:val="000000000000" w:firstRow="0" w:lastRow="0" w:firstColumn="0" w:lastColumn="0" w:oddVBand="0" w:evenVBand="0" w:oddHBand="0" w:evenHBand="0" w:firstRowFirstColumn="0" w:firstRowLastColumn="0" w:lastRowFirstColumn="0" w:lastRowLastColumn="0"/>
+              <w:rPr>
+                <w:b/>
+              </w:rPr>
             </w:pPr>
             <w:r>
+              <w:rPr>
+                <w:b/>
+              </w:rPr>
               <w:t>{</w:t>
             </w:r>
             <w:r>
+              <w:rPr>
+                <w:b/>
+              </w:rPr>
               <w:t>total</w:t>
             </w:r>
             <w:r>
+              <w:rPr>
+                <w:b/>
+              </w:rPr>
               <w:t>}</w:t>
             </w:r>
           </w:p>
@@ -861,7 +860,7 @@
               <v:stroke joinstyle="miter"/>
               <v:path gradientshapeok="t" o:connecttype="rect"/>
             </v:shapetype>
-            <v:shape id="Text Box 2" o:spid="_x0000_s1026" type="#_x0000_t202" style="position:absolute;margin-left:-22.45pt;margin-top:34.45pt;width:343.45pt;height:122.45pt;z-index:251668480;visibility:visible;mso-wrap-style:square;mso-width-percent:0;mso-height-percent:0;mso-wrap-distance-left:9pt;mso-wrap-distance-top:3.6pt;mso-wrap-distance-right:9pt;mso-wrap-distance-bottom:3.6pt;mso-position-horizontal:absolute;mso-position-horizontal-relative:text;mso-position-vertical:absolute;mso-position-vertical-relative:text;mso-width-percent:0;mso-height-percent:0;mso-width-relative:margin;mso-height-relative:margin;v-text-anchor:top" o:gfxdata="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" filled="f" stroked="f">
+            <v:shape id="Text Box 2" o:spid="_x0000_s1026" type="#_x0000_t202" style="position:absolute;margin-left:-22.45pt;margin-top:34.45pt;width:343.45pt;height:122.45pt;z-index:251668480;visibility:visible;mso-wrap-style:square;mso-width-percent:0;mso-height-percent:0;mso-wrap-distance-left:9pt;mso-wrap-distance-top:3.6pt;mso-wrap-distance-right:9pt;mso-wrap-distance-bottom:3.6pt;mso-position-horizontal:absolute;mso-position-horizontal-relative:text;mso-position-vertical:absolute;mso-position-vertical-relative:text;mso-width-percent:0;mso-height-percent:0;mso-width-relative:margin;mso-height-relative:margin;v-text-anchor:top" o:gfxdata="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" filled="f" stroked="f">
               <v:textbox>
                 <w:txbxContent>
                   <w:p/>
@@ -1996,7 +1995,7 @@
 </file>
 
 <file path=customXml/itemProps1.xml><?xml version="1.0" encoding="utf-8"?>
-<ds:datastoreItem xmlns:ds="http://schemas.openxmlformats.org/officeDocument/2006/customXml" ds:itemID="{F84050A8-344C-C046-889B-A22A47558A18}">
+<ds:datastoreItem xmlns:ds="http://schemas.openxmlformats.org/officeDocument/2006/customXml" ds:itemID="{B2C02188-B73F-4D8A-9DC4-8FEF9D3912FC}">
   <ds:schemaRefs>
     <ds:schemaRef ds:uri="http://schemas.openxmlformats.org/officeDocument/2006/bibliography"/>
   </ds:schemaRefs>

</xml_diff>